<commit_message>
Fix error base on unit test
</commit_message>
<xml_diff>
--- a/FC723 Portfolio Project 2 Documentation.docx
+++ b/FC723 Portfolio Project 2 Documentation.docx
@@ -21,6 +21,146 @@
           <w:lang w:val="en-US"/>
         </w:rPr>
       </w:pPr>
+      <w:r>
+        <w:rPr>
+          <w:lang w:val="en-US"/>
+        </w:rPr>
+        <w:t xml:space="preserve">The first error using unit test is I </w:t>
+      </w:r>
+      <w:r>
+        <w:rPr>
+          <w:lang w:val="en-US"/>
+        </w:rPr>
+        <w:t xml:space="preserve">realize that </w:t>
+      </w:r>
+      <w:r>
+        <w:rPr>
+          <w:lang w:val="en-US"/>
+        </w:rPr>
+        <w:t>I can’t do sum in 2s’compliment</w:t>
+      </w:r>
+    </w:p>
+    <w:p>
+      <w:pPr>
+        <w:rPr>
+          <w:lang w:val="en-US"/>
+        </w:rPr>
+      </w:pPr>
+      <w:r>
+        <w:rPr>
+          <w:noProof/>
+          <w:lang w:val="en-US"/>
+        </w:rPr>
+        <w:drawing>
+          <wp:inline distT="0" distB="0" distL="0" distR="0" wp14:anchorId="13116BF4" wp14:editId="7D15D6A7">
+            <wp:extent cx="5731510" cy="3727450"/>
+            <wp:effectExtent l="0" t="0" r="0" b="6350"/>
+            <wp:docPr id="642681590" name="Picture 1"/>
+            <wp:cNvGraphicFramePr>
+              <a:graphicFrameLocks xmlns:a="http://schemas.openxmlformats.org/drawingml/2006/main" noChangeAspect="1"/>
+            </wp:cNvGraphicFramePr>
+            <a:graphic xmlns:a="http://schemas.openxmlformats.org/drawingml/2006/main">
+              <a:graphicData uri="http://schemas.openxmlformats.org/drawingml/2006/picture">
+                <pic:pic xmlns:pic="http://schemas.openxmlformats.org/drawingml/2006/picture">
+                  <pic:nvPicPr>
+                    <pic:cNvPr id="642681590" name="Picture 642681590"/>
+                    <pic:cNvPicPr/>
+                  </pic:nvPicPr>
+                  <pic:blipFill>
+                    <a:blip r:embed="rId5" cstate="print">
+                      <a:extLst>
+                        <a:ext uri="{28A0092B-C50C-407E-A947-70E740481C1C}">
+                          <a14:useLocalDpi xmlns:a14="http://schemas.microsoft.com/office/drawing/2010/main" val="0"/>
+                        </a:ext>
+                      </a:extLst>
+                    </a:blip>
+                    <a:stretch>
+                      <a:fillRect/>
+                    </a:stretch>
+                  </pic:blipFill>
+                  <pic:spPr>
+                    <a:xfrm>
+                      <a:off x="0" y="0"/>
+                      <a:ext cx="5731510" cy="3727450"/>
+                    </a:xfrm>
+                    <a:prstGeom prst="rect">
+                      <a:avLst/>
+                    </a:prstGeom>
+                  </pic:spPr>
+                </pic:pic>
+              </a:graphicData>
+            </a:graphic>
+          </wp:inline>
+        </w:drawing>
+      </w:r>
+    </w:p>
+    <w:p>
+      <w:pPr>
+        <w:rPr>
+          <w:lang w:val="en-US"/>
+        </w:rPr>
+      </w:pPr>
+      <w:r>
+        <w:rPr>
+          <w:noProof/>
+          <w:lang w:val="en-US"/>
+        </w:rPr>
+        <w:drawing>
+          <wp:inline distT="0" distB="0" distL="0" distR="0" wp14:anchorId="43DA714F" wp14:editId="291F58D2">
+            <wp:extent cx="5731510" cy="3727450"/>
+            <wp:effectExtent l="0" t="0" r="0" b="6350"/>
+            <wp:docPr id="1037420299" name="Picture 2"/>
+            <wp:cNvGraphicFramePr>
+              <a:graphicFrameLocks xmlns:a="http://schemas.openxmlformats.org/drawingml/2006/main" noChangeAspect="1"/>
+            </wp:cNvGraphicFramePr>
+            <a:graphic xmlns:a="http://schemas.openxmlformats.org/drawingml/2006/main">
+              <a:graphicData uri="http://schemas.openxmlformats.org/drawingml/2006/picture">
+                <pic:pic xmlns:pic="http://schemas.openxmlformats.org/drawingml/2006/picture">
+                  <pic:nvPicPr>
+                    <pic:cNvPr id="1037420299" name="Picture 1037420299"/>
+                    <pic:cNvPicPr/>
+                  </pic:nvPicPr>
+                  <pic:blipFill>
+                    <a:blip r:embed="rId6" cstate="print">
+                      <a:extLst>
+                        <a:ext uri="{28A0092B-C50C-407E-A947-70E740481C1C}">
+                          <a14:useLocalDpi xmlns:a14="http://schemas.microsoft.com/office/drawing/2010/main" val="0"/>
+                        </a:ext>
+                      </a:extLst>
+                    </a:blip>
+                    <a:stretch>
+                      <a:fillRect/>
+                    </a:stretch>
+                  </pic:blipFill>
+                  <pic:spPr>
+                    <a:xfrm>
+                      <a:off x="0" y="0"/>
+                      <a:ext cx="5731510" cy="3727450"/>
+                    </a:xfrm>
+                    <a:prstGeom prst="rect">
+                      <a:avLst/>
+                    </a:prstGeom>
+                  </pic:spPr>
+                </pic:pic>
+              </a:graphicData>
+            </a:graphic>
+          </wp:inline>
+        </w:drawing>
+      </w:r>
+    </w:p>
+    <w:p>
+      <w:pPr>
+        <w:rPr>
+          <w:lang w:val="en-US"/>
+        </w:rPr>
+      </w:pPr>
+    </w:p>
+    <w:p>
+      <w:pPr>
+        <w:rPr>
+          <w:lang w:val="en-US"/>
+        </w:rPr>
+      </w:pPr>
     </w:p>
     <w:p>
       <w:pPr>
@@ -1230,7 +1370,19 @@
           <w:lang w:val="en-US"/>
         </w:rPr>
         <w:tab/>
-        <w:t xml:space="preserve">Def </w:t>
+        <w:t>Def</w:t>
+      </w:r>
+      <w:r>
+        <w:rPr>
+          <w:lang w:val="en-US"/>
+        </w:rPr>
+        <w:t>ine function</w:t>
+      </w:r>
+      <w:r>
+        <w:rPr>
+          <w:lang w:val="en-US"/>
+        </w:rPr>
+        <w:t xml:space="preserve"> </w:t>
       </w:r>
       <w:r>
         <w:rPr>
@@ -1656,6 +1808,936 @@
           <w:lang w:val="en-US"/>
         </w:rPr>
       </w:pPr>
+      <w:r>
+        <w:rPr>
+          <w:lang w:val="en-US"/>
+        </w:rPr>
+        <w:tab/>
+        <w:t xml:space="preserve">Define function </w:t>
+      </w:r>
+      <w:proofErr w:type="spellStart"/>
+      <w:r>
+        <w:rPr>
+          <w:lang w:val="en-US"/>
+        </w:rPr>
+        <w:t>check_</w:t>
+      </w:r>
+      <w:proofErr w:type="gramStart"/>
+      <w:r>
+        <w:rPr>
+          <w:lang w:val="en-US"/>
+        </w:rPr>
+        <w:t>balance</w:t>
+      </w:r>
+      <w:proofErr w:type="spellEnd"/>
+      <w:r>
+        <w:rPr>
+          <w:lang w:val="en-US"/>
+        </w:rPr>
+        <w:t>(</w:t>
+      </w:r>
+      <w:proofErr w:type="gramEnd"/>
+      <w:r>
+        <w:rPr>
+          <w:lang w:val="en-US"/>
+        </w:rPr>
+        <w:t>):</w:t>
+      </w:r>
+    </w:p>
+    <w:p>
+      <w:pPr>
+        <w:tabs>
+          <w:tab w:val="left" w:pos="668"/>
+        </w:tabs>
+        <w:rPr>
+          <w:lang w:val="en-US"/>
+        </w:rPr>
+      </w:pPr>
+      <w:r>
+        <w:rPr>
+          <w:lang w:val="en-US"/>
+        </w:rPr>
+        <w:tab/>
+      </w:r>
+      <w:r>
+        <w:rPr>
+          <w:lang w:val="en-US"/>
+        </w:rPr>
+        <w:tab/>
+      </w:r>
+      <w:r>
+        <w:rPr>
+          <w:lang w:val="en-US"/>
+        </w:rPr>
+        <w:tab/>
+      </w:r>
+      <w:proofErr w:type="spellStart"/>
+      <w:r>
+        <w:rPr>
+          <w:lang w:val="en-US"/>
+        </w:rPr>
+        <w:t>Decimal_balance</w:t>
+      </w:r>
+      <w:proofErr w:type="spellEnd"/>
+      <w:r>
+        <w:rPr>
+          <w:lang w:val="en-US"/>
+        </w:rPr>
+        <w:t xml:space="preserve"> = </w:t>
+      </w:r>
+      <w:r>
+        <w:rPr>
+          <w:lang w:val="en-US"/>
+        </w:rPr>
+        <w:t>_2scompliment_to_dec(</w:t>
+      </w:r>
+      <w:proofErr w:type="spellStart"/>
+      <w:r>
+        <w:rPr>
+          <w:lang w:val="en-US"/>
+        </w:rPr>
+        <w:t>binary_balance</w:t>
+      </w:r>
+      <w:proofErr w:type="spellEnd"/>
+      <w:r>
+        <w:rPr>
+          <w:lang w:val="en-US"/>
+        </w:rPr>
+        <w:t>)</w:t>
+      </w:r>
+    </w:p>
+    <w:p>
+      <w:pPr>
+        <w:tabs>
+          <w:tab w:val="left" w:pos="668"/>
+        </w:tabs>
+        <w:rPr>
+          <w:lang w:val="en-US"/>
+        </w:rPr>
+      </w:pPr>
+      <w:r>
+        <w:rPr>
+          <w:lang w:val="en-US"/>
+        </w:rPr>
+        <w:tab/>
+      </w:r>
+      <w:r>
+        <w:rPr>
+          <w:lang w:val="en-US"/>
+        </w:rPr>
+        <w:tab/>
+      </w:r>
+      <w:r>
+        <w:rPr>
+          <w:lang w:val="en-US"/>
+        </w:rPr>
+        <w:tab/>
+        <w:t xml:space="preserve">Return </w:t>
+      </w:r>
+      <w:proofErr w:type="spellStart"/>
+      <w:r>
+        <w:rPr>
+          <w:lang w:val="en-US"/>
+        </w:rPr>
+        <w:t>decimal_balance</w:t>
+      </w:r>
+      <w:proofErr w:type="spellEnd"/>
+    </w:p>
+    <w:p>
+      <w:pPr>
+        <w:tabs>
+          <w:tab w:val="left" w:pos="668"/>
+        </w:tabs>
+        <w:rPr>
+          <w:lang w:val="en-US"/>
+        </w:rPr>
+      </w:pPr>
+      <w:r>
+        <w:rPr>
+          <w:lang w:val="en-US"/>
+        </w:rPr>
+        <w:tab/>
+      </w:r>
+      <w:r>
+        <w:rPr>
+          <w:lang w:val="en-US"/>
+        </w:rPr>
+        <w:tab/>
+      </w:r>
+      <w:r>
+        <w:rPr>
+          <w:lang w:val="en-US"/>
+        </w:rPr>
+        <w:tab/>
+        <w:t>End</w:t>
+      </w:r>
+    </w:p>
+    <w:p>
+      <w:pPr>
+        <w:tabs>
+          <w:tab w:val="left" w:pos="668"/>
+        </w:tabs>
+        <w:rPr>
+          <w:lang w:val="en-US"/>
+        </w:rPr>
+      </w:pPr>
+      <w:r>
+        <w:rPr>
+          <w:lang w:val="en-US"/>
+        </w:rPr>
+        <w:tab/>
+        <w:t xml:space="preserve">Define </w:t>
+      </w:r>
+      <w:r>
+        <w:rPr>
+          <w:lang w:val="en-US"/>
+        </w:rPr>
+        <w:t xml:space="preserve">function </w:t>
+      </w:r>
+      <w:proofErr w:type="spellStart"/>
+      <w:r>
+        <w:rPr>
+          <w:lang w:val="en-US"/>
+        </w:rPr>
+        <w:t>deposit_money</w:t>
+      </w:r>
+      <w:proofErr w:type="spellEnd"/>
+      <w:r>
+        <w:rPr>
+          <w:lang w:val="en-US"/>
+        </w:rPr>
+        <w:t>(deposit):</w:t>
+      </w:r>
+    </w:p>
+    <w:p>
+      <w:pPr>
+        <w:tabs>
+          <w:tab w:val="left" w:pos="668"/>
+        </w:tabs>
+        <w:rPr>
+          <w:lang w:val="en-US"/>
+        </w:rPr>
+      </w:pPr>
+      <w:r>
+        <w:rPr>
+          <w:lang w:val="en-US"/>
+        </w:rPr>
+        <w:lastRenderedPageBreak/>
+        <w:tab/>
+      </w:r>
+      <w:r>
+        <w:rPr>
+          <w:lang w:val="en-US"/>
+        </w:rPr>
+        <w:tab/>
+      </w:r>
+      <w:r>
+        <w:rPr>
+          <w:lang w:val="en-US"/>
+        </w:rPr>
+        <w:tab/>
+      </w:r>
+      <w:proofErr w:type="spellStart"/>
+      <w:r>
+        <w:rPr>
+          <w:lang w:val="en-US"/>
+        </w:rPr>
+        <w:t>Current_balance</w:t>
+      </w:r>
+      <w:proofErr w:type="spellEnd"/>
+      <w:r>
+        <w:rPr>
+          <w:lang w:val="en-US"/>
+        </w:rPr>
+        <w:t xml:space="preserve"> = </w:t>
+      </w:r>
+      <w:proofErr w:type="spellStart"/>
+      <w:r>
+        <w:rPr>
+          <w:lang w:val="en-US"/>
+        </w:rPr>
+        <w:t>check_balance</w:t>
+      </w:r>
+      <w:proofErr w:type="spellEnd"/>
+    </w:p>
+    <w:p>
+      <w:pPr>
+        <w:tabs>
+          <w:tab w:val="left" w:pos="668"/>
+        </w:tabs>
+        <w:rPr>
+          <w:lang w:val="en-US"/>
+        </w:rPr>
+      </w:pPr>
+      <w:r>
+        <w:rPr>
+          <w:lang w:val="en-US"/>
+        </w:rPr>
+        <w:tab/>
+      </w:r>
+      <w:r>
+        <w:rPr>
+          <w:lang w:val="en-US"/>
+        </w:rPr>
+        <w:tab/>
+      </w:r>
+      <w:r>
+        <w:rPr>
+          <w:lang w:val="en-US"/>
+        </w:rPr>
+        <w:tab/>
+      </w:r>
+      <w:proofErr w:type="spellStart"/>
+      <w:r>
+        <w:rPr>
+          <w:lang w:val="en-US"/>
+        </w:rPr>
+        <w:t>New_balance</w:t>
+      </w:r>
+      <w:proofErr w:type="spellEnd"/>
+      <w:r>
+        <w:rPr>
+          <w:lang w:val="en-US"/>
+        </w:rPr>
+        <w:t xml:space="preserve"> = </w:t>
+      </w:r>
+      <w:proofErr w:type="spellStart"/>
+      <w:r>
+        <w:rPr>
+          <w:lang w:val="en-US"/>
+        </w:rPr>
+        <w:t>current_balance</w:t>
+      </w:r>
+      <w:proofErr w:type="spellEnd"/>
+      <w:r>
+        <w:rPr>
+          <w:lang w:val="en-US"/>
+        </w:rPr>
+        <w:t xml:space="preserve"> + deposi</w:t>
+      </w:r>
+      <w:r>
+        <w:rPr>
+          <w:lang w:val="en-US"/>
+        </w:rPr>
+        <w:t>t</w:t>
+      </w:r>
+    </w:p>
+    <w:p>
+      <w:pPr>
+        <w:tabs>
+          <w:tab w:val="left" w:pos="668"/>
+        </w:tabs>
+        <w:rPr>
+          <w:lang w:val="en-US"/>
+        </w:rPr>
+      </w:pPr>
+      <w:r>
+        <w:rPr>
+          <w:lang w:val="en-US"/>
+        </w:rPr>
+        <w:tab/>
+      </w:r>
+      <w:r>
+        <w:rPr>
+          <w:lang w:val="en-US"/>
+        </w:rPr>
+        <w:tab/>
+      </w:r>
+      <w:r>
+        <w:rPr>
+          <w:lang w:val="en-US"/>
+        </w:rPr>
+        <w:tab/>
+      </w:r>
+      <w:proofErr w:type="spellStart"/>
+      <w:r>
+        <w:rPr>
+          <w:lang w:val="en-US"/>
+        </w:rPr>
+        <w:t>Self.binary_balance</w:t>
+      </w:r>
+      <w:proofErr w:type="spellEnd"/>
+      <w:r>
+        <w:rPr>
+          <w:lang w:val="en-US"/>
+        </w:rPr>
+        <w:t xml:space="preserve"> = dec_</w:t>
+      </w:r>
+      <w:r>
+        <w:rPr>
+          <w:lang w:val="en-US"/>
+        </w:rPr>
+        <w:t>to_</w:t>
+      </w:r>
+      <w:r>
+        <w:rPr>
+          <w:lang w:val="en-US"/>
+        </w:rPr>
+        <w:t>2scompliment(</w:t>
+      </w:r>
+      <w:proofErr w:type="spellStart"/>
+      <w:r>
+        <w:rPr>
+          <w:lang w:val="en-US"/>
+        </w:rPr>
+        <w:t>new_balance</w:t>
+      </w:r>
+      <w:proofErr w:type="spellEnd"/>
+      <w:r>
+        <w:rPr>
+          <w:lang w:val="en-US"/>
+        </w:rPr>
+        <w:t>)</w:t>
+      </w:r>
+    </w:p>
+    <w:p>
+      <w:pPr>
+        <w:tabs>
+          <w:tab w:val="left" w:pos="668"/>
+        </w:tabs>
+        <w:rPr>
+          <w:lang w:val="en-US"/>
+        </w:rPr>
+      </w:pPr>
+      <w:r>
+        <w:rPr>
+          <w:lang w:val="en-US"/>
+        </w:rPr>
+        <w:tab/>
+      </w:r>
+      <w:r>
+        <w:rPr>
+          <w:lang w:val="en-US"/>
+        </w:rPr>
+        <w:tab/>
+      </w:r>
+      <w:r>
+        <w:rPr>
+          <w:lang w:val="en-US"/>
+        </w:rPr>
+        <w:tab/>
+        <w:t xml:space="preserve">Return </w:t>
+      </w:r>
+      <w:proofErr w:type="spellStart"/>
+      <w:r>
+        <w:rPr>
+          <w:lang w:val="en-US"/>
+        </w:rPr>
+        <w:t>new_balance</w:t>
+      </w:r>
+      <w:proofErr w:type="spellEnd"/>
+    </w:p>
+    <w:p>
+      <w:pPr>
+        <w:tabs>
+          <w:tab w:val="left" w:pos="668"/>
+        </w:tabs>
+        <w:rPr>
+          <w:lang w:val="en-US"/>
+        </w:rPr>
+      </w:pPr>
+      <w:r>
+        <w:rPr>
+          <w:lang w:val="en-US"/>
+        </w:rPr>
+        <w:tab/>
+      </w:r>
+      <w:r>
+        <w:rPr>
+          <w:lang w:val="en-US"/>
+        </w:rPr>
+        <w:tab/>
+      </w:r>
+      <w:r>
+        <w:rPr>
+          <w:lang w:val="en-US"/>
+        </w:rPr>
+        <w:tab/>
+        <w:t>End</w:t>
+      </w:r>
+    </w:p>
+    <w:p>
+      <w:pPr>
+        <w:tabs>
+          <w:tab w:val="left" w:pos="668"/>
+        </w:tabs>
+        <w:rPr>
+          <w:lang w:val="en-US"/>
+        </w:rPr>
+      </w:pPr>
+      <w:r>
+        <w:rPr>
+          <w:lang w:val="en-US"/>
+        </w:rPr>
+        <w:tab/>
+        <w:t xml:space="preserve">Def function </w:t>
+      </w:r>
+      <w:proofErr w:type="spellStart"/>
+      <w:r>
+        <w:rPr>
+          <w:lang w:val="en-US"/>
+        </w:rPr>
+        <w:t>withdraw_money</w:t>
+      </w:r>
+      <w:proofErr w:type="spellEnd"/>
+      <w:r>
+        <w:rPr>
+          <w:lang w:val="en-US"/>
+        </w:rPr>
+        <w:t>(withdraw):</w:t>
+      </w:r>
+    </w:p>
+    <w:p>
+      <w:pPr>
+        <w:tabs>
+          <w:tab w:val="left" w:pos="668"/>
+        </w:tabs>
+        <w:rPr>
+          <w:lang w:val="en-US"/>
+        </w:rPr>
+      </w:pPr>
+      <w:r>
+        <w:rPr>
+          <w:lang w:val="en-US"/>
+        </w:rPr>
+        <w:tab/>
+      </w:r>
+      <w:r>
+        <w:rPr>
+          <w:lang w:val="en-US"/>
+        </w:rPr>
+        <w:tab/>
+      </w:r>
+      <w:r>
+        <w:rPr>
+          <w:lang w:val="en-US"/>
+        </w:rPr>
+        <w:tab/>
+      </w:r>
+      <w:proofErr w:type="spellStart"/>
+      <w:r>
+        <w:rPr>
+          <w:lang w:val="en-US"/>
+        </w:rPr>
+        <w:t>Current_balance</w:t>
+      </w:r>
+      <w:proofErr w:type="spellEnd"/>
+      <w:r>
+        <w:rPr>
+          <w:lang w:val="en-US"/>
+        </w:rPr>
+        <w:t xml:space="preserve"> = </w:t>
+      </w:r>
+      <w:proofErr w:type="spellStart"/>
+      <w:r>
+        <w:rPr>
+          <w:lang w:val="en-US"/>
+        </w:rPr>
+        <w:t>check_balance</w:t>
+      </w:r>
+      <w:proofErr w:type="spellEnd"/>
+    </w:p>
+    <w:p>
+      <w:pPr>
+        <w:tabs>
+          <w:tab w:val="left" w:pos="668"/>
+        </w:tabs>
+        <w:rPr>
+          <w:lang w:val="en-US"/>
+        </w:rPr>
+      </w:pPr>
+      <w:r>
+        <w:rPr>
+          <w:lang w:val="en-US"/>
+        </w:rPr>
+        <w:tab/>
+      </w:r>
+      <w:r>
+        <w:rPr>
+          <w:lang w:val="en-US"/>
+        </w:rPr>
+        <w:tab/>
+      </w:r>
+      <w:r>
+        <w:rPr>
+          <w:lang w:val="en-US"/>
+        </w:rPr>
+        <w:tab/>
+      </w:r>
+      <w:proofErr w:type="spellStart"/>
+      <w:r>
+        <w:rPr>
+          <w:lang w:val="en-US"/>
+        </w:rPr>
+        <w:t>After_withdraw</w:t>
+      </w:r>
+      <w:proofErr w:type="spellEnd"/>
+      <w:r>
+        <w:rPr>
+          <w:lang w:val="en-US"/>
+        </w:rPr>
+        <w:t xml:space="preserve"> = </w:t>
+      </w:r>
+      <w:proofErr w:type="spellStart"/>
+      <w:r>
+        <w:rPr>
+          <w:lang w:val="en-US"/>
+        </w:rPr>
+        <w:t>curr</w:t>
+      </w:r>
+      <w:r>
+        <w:rPr>
+          <w:lang w:val="en-US"/>
+        </w:rPr>
+        <w:t>ent</w:t>
+      </w:r>
+      <w:r>
+        <w:rPr>
+          <w:lang w:val="en-US"/>
+        </w:rPr>
+        <w:t>_balance</w:t>
+      </w:r>
+      <w:proofErr w:type="spellEnd"/>
+      <w:r>
+        <w:rPr>
+          <w:lang w:val="en-US"/>
+        </w:rPr>
+        <w:t xml:space="preserve"> – withdraw</w:t>
+      </w:r>
+    </w:p>
+    <w:p>
+      <w:pPr>
+        <w:tabs>
+          <w:tab w:val="left" w:pos="668"/>
+        </w:tabs>
+        <w:rPr>
+          <w:lang w:val="en-US"/>
+        </w:rPr>
+      </w:pPr>
+      <w:r>
+        <w:rPr>
+          <w:lang w:val="en-US"/>
+        </w:rPr>
+        <w:tab/>
+      </w:r>
+      <w:r>
+        <w:rPr>
+          <w:lang w:val="en-US"/>
+        </w:rPr>
+        <w:tab/>
+      </w:r>
+      <w:r>
+        <w:rPr>
+          <w:lang w:val="en-US"/>
+        </w:rPr>
+        <w:tab/>
+        <w:t xml:space="preserve">If </w:t>
+      </w:r>
+      <w:proofErr w:type="spellStart"/>
+      <w:r>
+        <w:rPr>
+          <w:lang w:val="en-US"/>
+        </w:rPr>
+        <w:t>after_withdraw</w:t>
+      </w:r>
+      <w:proofErr w:type="spellEnd"/>
+      <w:r>
+        <w:rPr>
+          <w:lang w:val="en-US"/>
+        </w:rPr>
+        <w:t xml:space="preserve"> </w:t>
+      </w:r>
+      <w:r>
+        <w:rPr>
+          <w:lang w:val="en-US"/>
+        </w:rPr>
+        <w:t>&lt; -1500:</w:t>
+      </w:r>
+    </w:p>
+    <w:p>
+      <w:pPr>
+        <w:tabs>
+          <w:tab w:val="left" w:pos="668"/>
+        </w:tabs>
+        <w:rPr>
+          <w:lang w:val="en-US"/>
+        </w:rPr>
+      </w:pPr>
+      <w:r>
+        <w:rPr>
+          <w:lang w:val="en-US"/>
+        </w:rPr>
+        <w:tab/>
+      </w:r>
+      <w:r>
+        <w:rPr>
+          <w:lang w:val="en-US"/>
+        </w:rPr>
+        <w:tab/>
+      </w:r>
+      <w:r>
+        <w:rPr>
+          <w:lang w:val="en-US"/>
+        </w:rPr>
+        <w:tab/>
+      </w:r>
+      <w:r>
+        <w:rPr>
+          <w:lang w:val="en-US"/>
+        </w:rPr>
+        <w:tab/>
+        <w:t>Print Error</w:t>
+      </w:r>
+    </w:p>
+    <w:p>
+      <w:pPr>
+        <w:tabs>
+          <w:tab w:val="left" w:pos="668"/>
+        </w:tabs>
+        <w:rPr>
+          <w:lang w:val="en-US"/>
+        </w:rPr>
+      </w:pPr>
+      <w:r>
+        <w:rPr>
+          <w:lang w:val="en-US"/>
+        </w:rPr>
+        <w:tab/>
+      </w:r>
+      <w:r>
+        <w:rPr>
+          <w:lang w:val="en-US"/>
+        </w:rPr>
+        <w:tab/>
+      </w:r>
+      <w:r>
+        <w:rPr>
+          <w:lang w:val="en-US"/>
+        </w:rPr>
+        <w:tab/>
+      </w:r>
+      <w:r>
+        <w:rPr>
+          <w:lang w:val="en-US"/>
+        </w:rPr>
+        <w:tab/>
+        <w:t>Return error</w:t>
+      </w:r>
+    </w:p>
+    <w:p>
+      <w:pPr>
+        <w:tabs>
+          <w:tab w:val="left" w:pos="668"/>
+        </w:tabs>
+        <w:rPr>
+          <w:lang w:val="en-US"/>
+        </w:rPr>
+      </w:pPr>
+      <w:r>
+        <w:rPr>
+          <w:lang w:val="en-US"/>
+        </w:rPr>
+        <w:tab/>
+      </w:r>
+      <w:r>
+        <w:rPr>
+          <w:lang w:val="en-US"/>
+        </w:rPr>
+        <w:tab/>
+      </w:r>
+      <w:r>
+        <w:rPr>
+          <w:lang w:val="en-US"/>
+        </w:rPr>
+        <w:tab/>
+      </w:r>
+      <w:r>
+        <w:rPr>
+          <w:lang w:val="en-US"/>
+        </w:rPr>
+        <w:t>E</w:t>
+      </w:r>
+      <w:r>
+        <w:rPr>
+          <w:lang w:val="en-US"/>
+        </w:rPr>
+        <w:t>lse</w:t>
+      </w:r>
+      <w:r>
+        <w:rPr>
+          <w:lang w:val="en-US"/>
+        </w:rPr>
+        <w:t>:</w:t>
+      </w:r>
+    </w:p>
+    <w:p>
+      <w:pPr>
+        <w:tabs>
+          <w:tab w:val="left" w:pos="668"/>
+        </w:tabs>
+        <w:rPr>
+          <w:lang w:val="en-US"/>
+        </w:rPr>
+      </w:pPr>
+      <w:r>
+        <w:rPr>
+          <w:lang w:val="en-US"/>
+        </w:rPr>
+        <w:tab/>
+      </w:r>
+      <w:r>
+        <w:rPr>
+          <w:lang w:val="en-US"/>
+        </w:rPr>
+        <w:tab/>
+      </w:r>
+      <w:r>
+        <w:rPr>
+          <w:lang w:val="en-US"/>
+        </w:rPr>
+        <w:tab/>
+      </w:r>
+      <w:r>
+        <w:rPr>
+          <w:lang w:val="en-US"/>
+        </w:rPr>
+        <w:tab/>
+      </w:r>
+      <w:proofErr w:type="spellStart"/>
+      <w:r>
+        <w:rPr>
+          <w:lang w:val="en-US"/>
+        </w:rPr>
+        <w:t>Self.binary_balance</w:t>
+      </w:r>
+      <w:proofErr w:type="spellEnd"/>
+      <w:r>
+        <w:rPr>
+          <w:lang w:val="en-US"/>
+        </w:rPr>
+        <w:t xml:space="preserve"> = dec_to_2scompliment(</w:t>
+      </w:r>
+      <w:proofErr w:type="spellStart"/>
+      <w:r>
+        <w:rPr>
+          <w:lang w:val="en-US"/>
+        </w:rPr>
+        <w:t>after_withdraw</w:t>
+      </w:r>
+      <w:proofErr w:type="spellEnd"/>
+      <w:r>
+        <w:rPr>
+          <w:lang w:val="en-US"/>
+        </w:rPr>
+        <w:t>)</w:t>
+      </w:r>
+    </w:p>
+    <w:p>
+      <w:pPr>
+        <w:tabs>
+          <w:tab w:val="left" w:pos="668"/>
+        </w:tabs>
+        <w:rPr>
+          <w:lang w:val="en-US"/>
+        </w:rPr>
+      </w:pPr>
+      <w:r>
+        <w:rPr>
+          <w:lang w:val="en-US"/>
+        </w:rPr>
+        <w:tab/>
+      </w:r>
+      <w:r>
+        <w:rPr>
+          <w:lang w:val="en-US"/>
+        </w:rPr>
+        <w:tab/>
+      </w:r>
+      <w:r>
+        <w:rPr>
+          <w:lang w:val="en-US"/>
+        </w:rPr>
+        <w:tab/>
+      </w:r>
+      <w:r>
+        <w:rPr>
+          <w:lang w:val="en-US"/>
+        </w:rPr>
+        <w:tab/>
+        <w:t xml:space="preserve">Print </w:t>
+      </w:r>
+      <w:proofErr w:type="spellStart"/>
+      <w:r>
+        <w:rPr>
+          <w:lang w:val="en-US"/>
+        </w:rPr>
+        <w:t>after_withdraw</w:t>
+      </w:r>
+      <w:proofErr w:type="spellEnd"/>
+    </w:p>
+    <w:p>
+      <w:pPr>
+        <w:tabs>
+          <w:tab w:val="left" w:pos="668"/>
+        </w:tabs>
+        <w:rPr>
+          <w:lang w:val="en-US"/>
+        </w:rPr>
+      </w:pPr>
+      <w:r>
+        <w:rPr>
+          <w:lang w:val="en-US"/>
+        </w:rPr>
+        <w:tab/>
+      </w:r>
+      <w:r>
+        <w:rPr>
+          <w:lang w:val="en-US"/>
+        </w:rPr>
+        <w:tab/>
+      </w:r>
+      <w:r>
+        <w:rPr>
+          <w:lang w:val="en-US"/>
+        </w:rPr>
+        <w:tab/>
+      </w:r>
+      <w:r>
+        <w:rPr>
+          <w:lang w:val="en-US"/>
+        </w:rPr>
+        <w:tab/>
+        <w:t>Return true</w:t>
+      </w:r>
+    </w:p>
+    <w:p>
+      <w:pPr>
+        <w:tabs>
+          <w:tab w:val="left" w:pos="668"/>
+        </w:tabs>
+        <w:rPr>
+          <w:lang w:val="en-US"/>
+        </w:rPr>
+      </w:pPr>
+      <w:r>
+        <w:rPr>
+          <w:lang w:val="en-US"/>
+        </w:rPr>
+        <w:tab/>
+      </w:r>
+      <w:r>
+        <w:rPr>
+          <w:lang w:val="en-US"/>
+        </w:rPr>
+        <w:tab/>
+      </w:r>
+      <w:r>
+        <w:rPr>
+          <w:lang w:val="en-US"/>
+        </w:rPr>
+        <w:tab/>
+        <w:t>End</w:t>
+      </w:r>
     </w:p>
     <w:sectPr>
       <w:pgSz w:w="11906" w:h="16838"/>

</xml_diff>